<commit_message>
Update project handoff for testing feedback
</commit_message>
<xml_diff>
--- a/MATH_TOOLS_MASTER_HANDOFF.docx
+++ b/MATH_TOOLS_MASTER_HANDOFF.docx
@@ -29,7 +29,7 @@
     </w:p>
     <w:p>
       <w:pPr>
-        <w:spacing w:after="360"/>
+        <w:spacing w:after="640"/>
         <w:jc w:val="center"/>
         <w:rPr>
           <w:b/>
@@ -38,25 +38,28 @@
       </w:pPr>
       <w:r>
         <w:rPr>
+          <w:rFonts w:hint="eastAsia"/>
           <w:b/>
           <w:sz w:val="28"/>
         </w:rPr>
-        <w:t>æ•°å­¦æ•™å­¦å·¥å…·å®Œæ•´äº¤æŽ¥æ–‡æ¡£</w:t>
-      </w:r>
-    </w:p>
-    <w:p>
-      <w:pPr>
-        <w:spacing w:after="640"/>
+        <w:t>数学教学工具完整交接文档</w:t>
+      </w:r>
+    </w:p>
+    <w:p>
+      <w:pPr>
+        <w:spacing w:after="120"/>
         <w:jc w:val="center"/>
         <w:rPr>
-          <w:sz w:val="20"/>
-        </w:rPr>
-      </w:pPr>
-      <w:r>
-        <w:rPr>
-          <w:sz w:val="20"/>
-        </w:rPr>
-        <w:t>Last updated: 14 October 2026 Â· Asia/Kuala_Lumpur</w:t>
+          <w:b/>
+          <w:sz w:val="28"/>
+        </w:rPr>
+      </w:pPr>
+      <w:r>
+        <w:rPr>
+          <w:b/>
+          <w:sz w:val="28"/>
+        </w:rPr>
+        <w:t>Last updated: 14 October 2026 - Asia/Kuala_Lumpur</w:t>
       </w:r>
     </w:p>
     <w:p>
@@ -145,7 +148,9 @@
           <w:tab w:val="right" w:leader="dot" w:pos="9984"/>
         </w:tabs>
         <w:rPr>
-          <w:noProof/>
+          <w:rFonts w:asciiTheme="minorHAnsi" w:eastAsiaTheme="minorEastAsia" w:hAnsiTheme="minorHAnsi"/>
+          <w:noProof/>
+          <w:sz w:val="24"/>
         </w:rPr>
       </w:pPr>
       <w:r>
@@ -179,7 +184,7 @@
         <w:rPr>
           <w:noProof/>
         </w:rPr>
-        <w:instrText xml:space="preserve"> PAGEREF _Toc242889251 \h </w:instrText>
+        <w:instrText xml:space="preserve"> PAGEREF _Toc242890197 \h </w:instrText>
       </w:r>
       <w:r>
         <w:rPr>
@@ -212,7 +217,9 @@
           <w:tab w:val="right" w:leader="dot" w:pos="9984"/>
         </w:tabs>
         <w:rPr>
-          <w:noProof/>
+          <w:rFonts w:asciiTheme="minorHAnsi" w:eastAsiaTheme="minorEastAsia" w:hAnsiTheme="minorHAnsi"/>
+          <w:noProof/>
+          <w:sz w:val="24"/>
         </w:rPr>
       </w:pPr>
       <w:r>
@@ -237,7 +244,7 @@
         <w:rPr>
           <w:noProof/>
         </w:rPr>
-        <w:instrText xml:space="preserve"> PAGEREF _Toc242889252 \h </w:instrText>
+        <w:instrText xml:space="preserve"> PAGEREF _Toc242890198 \h </w:instrText>
       </w:r>
       <w:r>
         <w:rPr>
@@ -270,7 +277,9 @@
           <w:tab w:val="right" w:leader="dot" w:pos="9984"/>
         </w:tabs>
         <w:rPr>
-          <w:noProof/>
+          <w:rFonts w:asciiTheme="minorHAnsi" w:eastAsiaTheme="minorEastAsia" w:hAnsiTheme="minorHAnsi"/>
+          <w:noProof/>
+          <w:sz w:val="24"/>
         </w:rPr>
       </w:pPr>
       <w:r>
@@ -295,7 +304,7 @@
         <w:rPr>
           <w:noProof/>
         </w:rPr>
-        <w:instrText xml:space="preserve"> PAGEREF _Toc242889253 \h </w:instrText>
+        <w:instrText xml:space="preserve"> PAGEREF _Toc242890199 \h </w:instrText>
       </w:r>
       <w:r>
         <w:rPr>
@@ -328,7 +337,9 @@
           <w:tab w:val="right" w:leader="dot" w:pos="9984"/>
         </w:tabs>
         <w:rPr>
-          <w:noProof/>
+          <w:rFonts w:asciiTheme="minorHAnsi" w:eastAsiaTheme="minorEastAsia" w:hAnsiTheme="minorHAnsi"/>
+          <w:noProof/>
+          <w:sz w:val="24"/>
         </w:rPr>
       </w:pPr>
       <w:r>
@@ -353,7 +364,7 @@
         <w:rPr>
           <w:noProof/>
         </w:rPr>
-        <w:instrText xml:space="preserve"> PAGEREF _Toc242889254 \h </w:instrText>
+        <w:instrText xml:space="preserve"> PAGEREF _Toc242890200 \h </w:instrText>
       </w:r>
       <w:r>
         <w:rPr>
@@ -386,7 +397,9 @@
           <w:tab w:val="right" w:leader="dot" w:pos="9984"/>
         </w:tabs>
         <w:rPr>
-          <w:noProof/>
+          <w:rFonts w:asciiTheme="minorHAnsi" w:eastAsiaTheme="minorEastAsia" w:hAnsiTheme="minorHAnsi"/>
+          <w:noProof/>
+          <w:sz w:val="24"/>
         </w:rPr>
       </w:pPr>
       <w:r>
@@ -411,7 +424,7 @@
         <w:rPr>
           <w:noProof/>
         </w:rPr>
-        <w:instrText xml:space="preserve"> PAGEREF _Toc242889255 \h </w:instrText>
+        <w:instrText xml:space="preserve"> PAGEREF _Toc242890201 \h </w:instrText>
       </w:r>
       <w:r>
         <w:rPr>
@@ -444,7 +457,9 @@
           <w:tab w:val="right" w:leader="dot" w:pos="9984"/>
         </w:tabs>
         <w:rPr>
-          <w:noProof/>
+          <w:rFonts w:asciiTheme="minorHAnsi" w:eastAsiaTheme="minorEastAsia" w:hAnsiTheme="minorHAnsi"/>
+          <w:noProof/>
+          <w:sz w:val="24"/>
         </w:rPr>
       </w:pPr>
       <w:r>
@@ -469,7 +484,7 @@
         <w:rPr>
           <w:noProof/>
         </w:rPr>
-        <w:instrText xml:space="preserve"> PAGEREF _Toc242889256 \h </w:instrText>
+        <w:instrText xml:space="preserve"> PAGEREF _Toc242890202 \h </w:instrText>
       </w:r>
       <w:r>
         <w:rPr>
@@ -502,7 +517,9 @@
           <w:tab w:val="right" w:leader="dot" w:pos="9984"/>
         </w:tabs>
         <w:rPr>
-          <w:noProof/>
+          <w:rFonts w:asciiTheme="minorHAnsi" w:eastAsiaTheme="minorEastAsia" w:hAnsiTheme="minorHAnsi"/>
+          <w:noProof/>
+          <w:sz w:val="24"/>
         </w:rPr>
       </w:pPr>
       <w:r>
@@ -527,7 +544,7 @@
         <w:rPr>
           <w:noProof/>
         </w:rPr>
-        <w:instrText xml:space="preserve"> PAGEREF _Toc242889257 \h </w:instrText>
+        <w:instrText xml:space="preserve"> PAGEREF _Toc242890203 \h </w:instrText>
       </w:r>
       <w:r>
         <w:rPr>
@@ -560,7 +577,9 @@
           <w:tab w:val="right" w:leader="dot" w:pos="9984"/>
         </w:tabs>
         <w:rPr>
-          <w:noProof/>
+          <w:rFonts w:asciiTheme="minorHAnsi" w:eastAsiaTheme="minorEastAsia" w:hAnsiTheme="minorHAnsi"/>
+          <w:noProof/>
+          <w:sz w:val="24"/>
         </w:rPr>
       </w:pPr>
       <w:r>
@@ -585,7 +604,7 @@
         <w:rPr>
           <w:noProof/>
         </w:rPr>
-        <w:instrText xml:space="preserve"> PAGEREF _Toc242889258 \h </w:instrText>
+        <w:instrText xml:space="preserve"> PAGEREF _Toc242890204 \h </w:instrText>
       </w:r>
       <w:r>
         <w:rPr>
@@ -618,7 +637,9 @@
           <w:tab w:val="right" w:leader="dot" w:pos="9984"/>
         </w:tabs>
         <w:rPr>
-          <w:noProof/>
+          <w:rFonts w:asciiTheme="minorHAnsi" w:eastAsiaTheme="minorEastAsia" w:hAnsiTheme="minorHAnsi"/>
+          <w:noProof/>
+          <w:sz w:val="24"/>
         </w:rPr>
       </w:pPr>
       <w:r>
@@ -643,7 +664,7 @@
         <w:rPr>
           <w:noProof/>
         </w:rPr>
-        <w:instrText xml:space="preserve"> PAGEREF _Toc242889259 \h </w:instrText>
+        <w:instrText xml:space="preserve"> PAGEREF _Toc242890205 \h </w:instrText>
       </w:r>
       <w:r>
         <w:rPr>
@@ -676,7 +697,9 @@
           <w:tab w:val="right" w:leader="dot" w:pos="9984"/>
         </w:tabs>
         <w:rPr>
-          <w:noProof/>
+          <w:rFonts w:asciiTheme="minorHAnsi" w:eastAsiaTheme="minorEastAsia" w:hAnsiTheme="minorHAnsi"/>
+          <w:noProof/>
+          <w:sz w:val="24"/>
         </w:rPr>
       </w:pPr>
       <w:r>
@@ -701,7 +724,7 @@
         <w:rPr>
           <w:noProof/>
         </w:rPr>
-        <w:instrText xml:space="preserve"> PAGEREF _Toc242889260 \h </w:instrText>
+        <w:instrText xml:space="preserve"> PAGEREF _Toc242890206 \h </w:instrText>
       </w:r>
       <w:r>
         <w:rPr>
@@ -734,7 +757,9 @@
           <w:tab w:val="right" w:leader="dot" w:pos="9984"/>
         </w:tabs>
         <w:rPr>
-          <w:noProof/>
+          <w:rFonts w:asciiTheme="minorHAnsi" w:eastAsiaTheme="minorEastAsia" w:hAnsiTheme="minorHAnsi"/>
+          <w:noProof/>
+          <w:sz w:val="24"/>
         </w:rPr>
       </w:pPr>
       <w:r>
@@ -759,7 +784,7 @@
         <w:rPr>
           <w:noProof/>
         </w:rPr>
-        <w:instrText xml:space="preserve"> PAGEREF _Toc242889261 \h </w:instrText>
+        <w:instrText xml:space="preserve"> PAGEREF _Toc242890207 \h </w:instrText>
       </w:r>
       <w:r>
         <w:rPr>
@@ -792,7 +817,9 @@
           <w:tab w:val="right" w:leader="dot" w:pos="9984"/>
         </w:tabs>
         <w:rPr>
-          <w:noProof/>
+          <w:rFonts w:asciiTheme="minorHAnsi" w:eastAsiaTheme="minorEastAsia" w:hAnsiTheme="minorHAnsi"/>
+          <w:noProof/>
+          <w:sz w:val="24"/>
         </w:rPr>
       </w:pPr>
       <w:r>
@@ -817,7 +844,7 @@
         <w:rPr>
           <w:noProof/>
         </w:rPr>
-        <w:instrText xml:space="preserve"> PAGEREF _Toc242889262 \h </w:instrText>
+        <w:instrText xml:space="preserve"> PAGEREF _Toc242890208 \h </w:instrText>
       </w:r>
       <w:r>
         <w:rPr>
@@ -850,7 +877,9 @@
           <w:tab w:val="right" w:leader="dot" w:pos="9984"/>
         </w:tabs>
         <w:rPr>
-          <w:noProof/>
+          <w:rFonts w:asciiTheme="minorHAnsi" w:eastAsiaTheme="minorEastAsia" w:hAnsiTheme="minorHAnsi"/>
+          <w:noProof/>
+          <w:sz w:val="24"/>
         </w:rPr>
       </w:pPr>
       <w:r>
@@ -875,7 +904,7 @@
         <w:rPr>
           <w:noProof/>
         </w:rPr>
-        <w:instrText xml:space="preserve"> PAGEREF _Toc242889263 \h </w:instrText>
+        <w:instrText xml:space="preserve"> PAGEREF _Toc242890209 \h </w:instrText>
       </w:r>
       <w:r>
         <w:rPr>
@@ -908,7 +937,9 @@
           <w:tab w:val="right" w:leader="dot" w:pos="9984"/>
         </w:tabs>
         <w:rPr>
-          <w:noProof/>
+          <w:rFonts w:asciiTheme="minorHAnsi" w:eastAsiaTheme="minorEastAsia" w:hAnsiTheme="minorHAnsi"/>
+          <w:noProof/>
+          <w:sz w:val="24"/>
         </w:rPr>
       </w:pPr>
       <w:r>
@@ -933,7 +964,7 @@
         <w:rPr>
           <w:noProof/>
         </w:rPr>
-        <w:instrText xml:space="preserve"> PAGEREF _Toc242889264 \h </w:instrText>
+        <w:instrText xml:space="preserve"> PAGEREF _Toc242890210 \h </w:instrText>
       </w:r>
       <w:r>
         <w:rPr>
@@ -966,7 +997,9 @@
           <w:tab w:val="right" w:leader="dot" w:pos="9984"/>
         </w:tabs>
         <w:rPr>
-          <w:noProof/>
+          <w:rFonts w:asciiTheme="minorHAnsi" w:eastAsiaTheme="minorEastAsia" w:hAnsiTheme="minorHAnsi"/>
+          <w:noProof/>
+          <w:sz w:val="24"/>
         </w:rPr>
       </w:pPr>
       <w:r>
@@ -991,7 +1024,7 @@
         <w:rPr>
           <w:noProof/>
         </w:rPr>
-        <w:instrText xml:space="preserve"> PAGEREF _Toc242889265 \h </w:instrText>
+        <w:instrText xml:space="preserve"> PAGEREF _Toc242890211 \h </w:instrText>
       </w:r>
       <w:r>
         <w:rPr>
@@ -1024,7 +1057,9 @@
           <w:tab w:val="right" w:leader="dot" w:pos="9984"/>
         </w:tabs>
         <w:rPr>
-          <w:noProof/>
+          <w:rFonts w:asciiTheme="minorHAnsi" w:eastAsiaTheme="minorEastAsia" w:hAnsiTheme="minorHAnsi"/>
+          <w:noProof/>
+          <w:sz w:val="24"/>
         </w:rPr>
       </w:pPr>
       <w:r>
@@ -1049,7 +1084,7 @@
         <w:rPr>
           <w:noProof/>
         </w:rPr>
-        <w:instrText xml:space="preserve"> PAGEREF _Toc242889266 \h </w:instrText>
+        <w:instrText xml:space="preserve"> PAGEREF _Toc242890212 \h </w:instrText>
       </w:r>
       <w:r>
         <w:rPr>
@@ -1082,7 +1117,9 @@
           <w:tab w:val="right" w:leader="dot" w:pos="9984"/>
         </w:tabs>
         <w:rPr>
-          <w:noProof/>
+          <w:rFonts w:asciiTheme="minorHAnsi" w:eastAsiaTheme="minorEastAsia" w:hAnsiTheme="minorHAnsi"/>
+          <w:noProof/>
+          <w:sz w:val="24"/>
         </w:rPr>
       </w:pPr>
       <w:r>
@@ -1107,7 +1144,7 @@
         <w:rPr>
           <w:noProof/>
         </w:rPr>
-        <w:instrText xml:space="preserve"> PAGEREF _Toc242889267 \h </w:instrText>
+        <w:instrText xml:space="preserve"> PAGEREF _Toc242890213 \h </w:instrText>
       </w:r>
       <w:r>
         <w:rPr>
@@ -1140,7 +1177,9 @@
           <w:tab w:val="right" w:leader="dot" w:pos="9984"/>
         </w:tabs>
         <w:rPr>
-          <w:noProof/>
+          <w:rFonts w:asciiTheme="minorHAnsi" w:eastAsiaTheme="minorEastAsia" w:hAnsiTheme="minorHAnsi"/>
+          <w:noProof/>
+          <w:sz w:val="24"/>
         </w:rPr>
       </w:pPr>
       <w:r>
@@ -1165,7 +1204,7 @@
         <w:rPr>
           <w:noProof/>
         </w:rPr>
-        <w:instrText xml:space="preserve"> PAGEREF _Toc242889268 \h </w:instrText>
+        <w:instrText xml:space="preserve"> PAGEREF _Toc242890214 \h </w:instrText>
       </w:r>
       <w:r>
         <w:rPr>
@@ -1198,7 +1237,9 @@
           <w:tab w:val="right" w:leader="dot" w:pos="9984"/>
         </w:tabs>
         <w:rPr>
-          <w:noProof/>
+          <w:rFonts w:asciiTheme="minorHAnsi" w:eastAsiaTheme="minorEastAsia" w:hAnsiTheme="minorHAnsi"/>
+          <w:noProof/>
+          <w:sz w:val="24"/>
         </w:rPr>
       </w:pPr>
       <w:r>
@@ -1223,7 +1264,7 @@
         <w:rPr>
           <w:noProof/>
         </w:rPr>
-        <w:instrText xml:space="preserve"> PAGEREF _Toc242889269 \h </w:instrText>
+        <w:instrText xml:space="preserve"> PAGEREF _Toc242890215 \h </w:instrText>
       </w:r>
       <w:r>
         <w:rPr>
@@ -1256,7 +1297,9 @@
           <w:tab w:val="right" w:leader="dot" w:pos="9984"/>
         </w:tabs>
         <w:rPr>
-          <w:noProof/>
+          <w:rFonts w:asciiTheme="minorHAnsi" w:eastAsiaTheme="minorEastAsia" w:hAnsiTheme="minorHAnsi"/>
+          <w:noProof/>
+          <w:sz w:val="24"/>
         </w:rPr>
       </w:pPr>
       <w:r>
@@ -1281,7 +1324,7 @@
         <w:rPr>
           <w:noProof/>
         </w:rPr>
-        <w:instrText xml:space="preserve"> PAGEREF _Toc242889270 \h </w:instrText>
+        <w:instrText xml:space="preserve"> PAGEREF _Toc242890216 \h </w:instrText>
       </w:r>
       <w:r>
         <w:rPr>
@@ -1314,7 +1357,9 @@
           <w:tab w:val="right" w:leader="dot" w:pos="9984"/>
         </w:tabs>
         <w:rPr>
-          <w:noProof/>
+          <w:rFonts w:asciiTheme="minorHAnsi" w:eastAsiaTheme="minorEastAsia" w:hAnsiTheme="minorHAnsi"/>
+          <w:noProof/>
+          <w:sz w:val="24"/>
         </w:rPr>
       </w:pPr>
       <w:r>
@@ -1339,7 +1384,7 @@
         <w:rPr>
           <w:noProof/>
         </w:rPr>
-        <w:instrText xml:space="preserve"> PAGEREF _Toc242889271 \h </w:instrText>
+        <w:instrText xml:space="preserve"> PAGEREF _Toc242890217 \h </w:instrText>
       </w:r>
       <w:r>
         <w:rPr>
@@ -1372,7 +1417,9 @@
           <w:tab w:val="right" w:leader="dot" w:pos="9984"/>
         </w:tabs>
         <w:rPr>
-          <w:noProof/>
+          <w:rFonts w:asciiTheme="minorHAnsi" w:eastAsiaTheme="minorEastAsia" w:hAnsiTheme="minorHAnsi"/>
+          <w:noProof/>
+          <w:sz w:val="24"/>
         </w:rPr>
       </w:pPr>
       <w:r>
@@ -1397,7 +1444,7 @@
         <w:rPr>
           <w:noProof/>
         </w:rPr>
-        <w:instrText xml:space="preserve"> PAGEREF _Toc242889272 \h </w:instrText>
+        <w:instrText xml:space="preserve"> PAGEREF _Toc242890218 \h </w:instrText>
       </w:r>
       <w:r>
         <w:rPr>
@@ -1414,7 +1461,7 @@
         <w:rPr>
           <w:noProof/>
         </w:rPr>
-        <w:t>7</w:t>
+        <w:t>8</w:t>
       </w:r>
       <w:r>
         <w:rPr>
@@ -1430,7 +1477,9 @@
           <w:tab w:val="right" w:leader="dot" w:pos="9984"/>
         </w:tabs>
         <w:rPr>
-          <w:noProof/>
+          <w:rFonts w:asciiTheme="minorHAnsi" w:eastAsiaTheme="minorEastAsia" w:hAnsiTheme="minorHAnsi"/>
+          <w:noProof/>
+          <w:sz w:val="24"/>
         </w:rPr>
       </w:pPr>
       <w:r>
@@ -1455,7 +1504,7 @@
         <w:rPr>
           <w:noProof/>
         </w:rPr>
-        <w:instrText xml:space="preserve"> PAGEREF _Toc242889273 \h </w:instrText>
+        <w:instrText xml:space="preserve"> PAGEREF _Toc242890219 \h </w:instrText>
       </w:r>
       <w:r>
         <w:rPr>
@@ -1488,7 +1537,9 @@
           <w:tab w:val="right" w:leader="dot" w:pos="9984"/>
         </w:tabs>
         <w:rPr>
-          <w:noProof/>
+          <w:rFonts w:asciiTheme="minorHAnsi" w:eastAsiaTheme="minorEastAsia" w:hAnsiTheme="minorHAnsi"/>
+          <w:noProof/>
+          <w:sz w:val="24"/>
         </w:rPr>
       </w:pPr>
       <w:r>
@@ -1513,7 +1564,7 @@
         <w:rPr>
           <w:noProof/>
         </w:rPr>
-        <w:instrText xml:space="preserve"> PAGEREF _Toc242889274 \h </w:instrText>
+        <w:instrText xml:space="preserve"> PAGEREF _Toc242890220 \h </w:instrText>
       </w:r>
       <w:r>
         <w:rPr>
@@ -1546,7 +1597,9 @@
           <w:tab w:val="right" w:leader="dot" w:pos="9984"/>
         </w:tabs>
         <w:rPr>
-          <w:noProof/>
+          <w:rFonts w:asciiTheme="minorHAnsi" w:eastAsiaTheme="minorEastAsia" w:hAnsiTheme="minorHAnsi"/>
+          <w:noProof/>
+          <w:sz w:val="24"/>
         </w:rPr>
       </w:pPr>
       <w:r>
@@ -1571,7 +1624,7 @@
         <w:rPr>
           <w:noProof/>
         </w:rPr>
-        <w:instrText xml:space="preserve"> PAGEREF _Toc242889275 \h </w:instrText>
+        <w:instrText xml:space="preserve"> PAGEREF _Toc242890221 \h </w:instrText>
       </w:r>
       <w:r>
         <w:rPr>
@@ -1604,7 +1657,9 @@
           <w:tab w:val="right" w:leader="dot" w:pos="9984"/>
         </w:tabs>
         <w:rPr>
-          <w:noProof/>
+          <w:rFonts w:asciiTheme="minorHAnsi" w:eastAsiaTheme="minorEastAsia" w:hAnsiTheme="minorHAnsi"/>
+          <w:noProof/>
+          <w:sz w:val="24"/>
         </w:rPr>
       </w:pPr>
       <w:r>
@@ -1629,7 +1684,7 @@
         <w:rPr>
           <w:noProof/>
         </w:rPr>
-        <w:instrText xml:space="preserve"> PAGEREF _Toc242889276 \h </w:instrText>
+        <w:instrText xml:space="preserve"> PAGEREF _Toc242890222 \h </w:instrText>
       </w:r>
       <w:r>
         <w:rPr>
@@ -1662,7 +1717,9 @@
           <w:tab w:val="right" w:leader="dot" w:pos="9984"/>
         </w:tabs>
         <w:rPr>
-          <w:noProof/>
+          <w:rFonts w:asciiTheme="minorHAnsi" w:eastAsiaTheme="minorEastAsia" w:hAnsiTheme="minorHAnsi"/>
+          <w:noProof/>
+          <w:sz w:val="24"/>
         </w:rPr>
       </w:pPr>
       <w:r>
@@ -1687,7 +1744,7 @@
         <w:rPr>
           <w:noProof/>
         </w:rPr>
-        <w:instrText xml:space="preserve"> PAGEREF _Toc242889277 \h </w:instrText>
+        <w:instrText xml:space="preserve"> PAGEREF _Toc242890223 \h </w:instrText>
       </w:r>
       <w:r>
         <w:rPr>
@@ -1720,7 +1777,9 @@
           <w:tab w:val="right" w:leader="dot" w:pos="9984"/>
         </w:tabs>
         <w:rPr>
-          <w:noProof/>
+          <w:rFonts w:asciiTheme="minorHAnsi" w:eastAsiaTheme="minorEastAsia" w:hAnsiTheme="minorHAnsi"/>
+          <w:noProof/>
+          <w:sz w:val="24"/>
         </w:rPr>
       </w:pPr>
       <w:r>
@@ -1745,7 +1804,7 @@
         <w:rPr>
           <w:noProof/>
         </w:rPr>
-        <w:instrText xml:space="preserve"> PAGEREF _Toc242889278 \h </w:instrText>
+        <w:instrText xml:space="preserve"> PAGEREF _Toc242890224 \h </w:instrText>
       </w:r>
       <w:r>
         <w:rPr>
@@ -1778,7 +1837,9 @@
           <w:tab w:val="right" w:leader="dot" w:pos="9984"/>
         </w:tabs>
         <w:rPr>
-          <w:noProof/>
+          <w:rFonts w:asciiTheme="minorHAnsi" w:eastAsiaTheme="minorEastAsia" w:hAnsiTheme="minorHAnsi"/>
+          <w:noProof/>
+          <w:sz w:val="24"/>
         </w:rPr>
       </w:pPr>
       <w:r>
@@ -1803,7 +1864,7 @@
         <w:rPr>
           <w:noProof/>
         </w:rPr>
-        <w:instrText xml:space="preserve"> PAGEREF _Toc242889279 \h </w:instrText>
+        <w:instrText xml:space="preserve"> PAGEREF _Toc242890225 \h </w:instrText>
       </w:r>
       <w:r>
         <w:rPr>
@@ -1836,7 +1897,9 @@
           <w:tab w:val="right" w:leader="dot" w:pos="9984"/>
         </w:tabs>
         <w:rPr>
-          <w:noProof/>
+          <w:rFonts w:asciiTheme="minorHAnsi" w:eastAsiaTheme="minorEastAsia" w:hAnsiTheme="minorHAnsi"/>
+          <w:noProof/>
+          <w:sz w:val="24"/>
         </w:rPr>
       </w:pPr>
       <w:r>
@@ -1861,7 +1924,7 @@
         <w:rPr>
           <w:noProof/>
         </w:rPr>
-        <w:instrText xml:space="preserve"> PAGEREF _Toc242889280 \h </w:instrText>
+        <w:instrText xml:space="preserve"> PAGEREF _Toc242890226 \h </w:instrText>
       </w:r>
       <w:r>
         <w:rPr>
@@ -1894,7 +1957,69 @@
           <w:tab w:val="right" w:leader="dot" w:pos="9984"/>
         </w:tabs>
         <w:rPr>
-          <w:noProof/>
+          <w:rFonts w:asciiTheme="minorHAnsi" w:eastAsiaTheme="minorEastAsia" w:hAnsiTheme="minorHAnsi"/>
+          <w:noProof/>
+          <w:sz w:val="24"/>
+        </w:rPr>
+      </w:pPr>
+      <w:r>
+        <w:rPr>
+          <w:noProof/>
+        </w:rPr>
+        <w:t>9. Do not push this new tool to production248 until the user tests it and explicitly approves production publishing.</w:t>
+      </w:r>
+      <w:r>
+        <w:rPr>
+          <w:noProof/>
+        </w:rPr>
+        <w:tab/>
+      </w:r>
+      <w:r>
+        <w:rPr>
+          <w:noProof/>
+        </w:rPr>
+        <w:fldChar w:fldCharType="begin"/>
+      </w:r>
+      <w:r>
+        <w:rPr>
+          <w:noProof/>
+        </w:rPr>
+        <w:instrText xml:space="preserve"> PAGEREF _Toc242890227 \h </w:instrText>
+      </w:r>
+      <w:r>
+        <w:rPr>
+          <w:noProof/>
+        </w:rPr>
+      </w:r>
+      <w:r>
+        <w:rPr>
+          <w:noProof/>
+        </w:rPr>
+        <w:fldChar w:fldCharType="separate"/>
+      </w:r>
+      <w:r>
+        <w:rPr>
+          <w:noProof/>
+        </w:rPr>
+        <w:t>9</w:t>
+      </w:r>
+      <w:r>
+        <w:rPr>
+          <w:noProof/>
+        </w:rPr>
+        <w:fldChar w:fldCharType="end"/>
+      </w:r>
+    </w:p>
+    <w:p>
+      <w:pPr>
+        <w:pStyle w:val="TOC1"/>
+        <w:tabs>
+          <w:tab w:val="right" w:leader="dot" w:pos="9984"/>
+        </w:tabs>
+        <w:rPr>
+          <w:rFonts w:asciiTheme="minorHAnsi" w:eastAsiaTheme="minorEastAsia" w:hAnsiTheme="minorHAnsi"/>
+          <w:noProof/>
+          <w:sz w:val="24"/>
         </w:rPr>
       </w:pPr>
       <w:r>
@@ -1919,7 +2044,7 @@
         <w:rPr>
           <w:noProof/>
         </w:rPr>
-        <w:instrText xml:space="preserve"> PAGEREF _Toc242889281 \h </w:instrText>
+        <w:instrText xml:space="preserve"> PAGEREF _Toc242890228 \h </w:instrText>
       </w:r>
       <w:r>
         <w:rPr>
@@ -1963,7 +2088,7 @@
         <w:pStyle w:val="Heading1"/>
         <w:spacing w:before="0"/>
       </w:pPr>
-      <w:bookmarkStart w:id="0" w:name="_Toc242889251"/>
+      <w:bookmarkStart w:id="0" w:name="_Toc242890197"/>
       <w:r>
         <w:lastRenderedPageBreak/>
         <w:t>Non-negotiable product rules</w:t>
@@ -1972,100 +2097,104 @@
     </w:p>
     <w:p>
       <w:pPr>
-        <w:pStyle w:val="ListNumber"/>
         <w:spacing w:after="60"/>
-      </w:pPr>
-      <w:r>
-        <w:t>These projects are classroom tools for teachers and pupils. They should be interactive manipulatives, demonstrations, builders, simulations, or visual laboratories.</w:t>
-      </w:r>
-    </w:p>
-    <w:p>
-      <w:pPr>
-        <w:pStyle w:val="ListNumber"/>
+        <w:ind w:left="360" w:hanging="360"/>
+      </w:pPr>
+      <w:r>
+        <w:t>1. These projects are classroom tools for teachers and pupils. They should be interactive manipulatives, demonstrations, builders, simulations, or visual laboratories.</w:t>
+      </w:r>
+    </w:p>
+    <w:p>
+      <w:pPr>
         <w:spacing w:after="60"/>
-      </w:pPr>
-      <w:r>
-        <w:t>Do not turn a tool into a generic question-and-answer page, reading drill, quiz flow, or story-question generator unless the user explicitly requests that format.</w:t>
-      </w:r>
-    </w:p>
-    <w:p>
-      <w:pPr>
-        <w:pStyle w:val="ListNumber"/>
+        <w:ind w:left="360" w:hanging="360"/>
+      </w:pPr>
+      <w:r>
+        <w:t>2. Do not turn a tool into a generic question-and-answer page, reading drill, quiz flow, or story-question generator unless the user explicitly requests that format.</w:t>
+      </w:r>
+    </w:p>
+    <w:p>
+      <w:pPr>
         <w:spacing w:after="60"/>
-      </w:pPr>
-      <w:r>
-        <w:t>Every activity must follow the relevant Malaysian SK or SJKC textbook or another source supplied or approved by the user. Do not invent curriculum topics, year-level coverage, textbook examples, or unsupported calculation methods.</w:t>
-      </w:r>
-    </w:p>
-    <w:p>
-      <w:pPr>
-        <w:pStyle w:val="ListNumber"/>
+        <w:ind w:left="360" w:hanging="360"/>
+      </w:pPr>
+      <w:r>
+        <w:t>3. Every activity must follow the relevant Malaysian SK or SJKC textbook or another source supplied or approved by the user. Do not invent curriculum topics, year-level coverage, textbook examples, or unsupported calculation methods.</w:t>
+      </w:r>
+    </w:p>
+    <w:p>
+      <w:pPr>
         <w:spacing w:after="60"/>
-      </w:pPr>
-      <w:r>
-        <w:t>If the textbook source is missing, ask for the PDF or inspect an approved source before implementing curriculum-dependent content.</w:t>
-      </w:r>
-    </w:p>
-    <w:p>
-      <w:pPr>
-        <w:pStyle w:val="ListNumber"/>
+        <w:ind w:left="360" w:hanging="360"/>
+      </w:pPr>
+      <w:r>
+        <w:t>4. If the textbook source is missing, ask for the PDF or inspect an approved source before implementing curriculum-dependent content.</w:t>
+      </w:r>
+    </w:p>
+    <w:p>
+      <w:pPr>
         <w:spacing w:after="60"/>
-      </w:pPr>
-      <w:r>
-        <w:t>Answers that pupils are meant to discover should initially appear as ? or remain hidden. Reveal them only after the intended manipulation or an explicit reveal action.</w:t>
-      </w:r>
-    </w:p>
-    <w:p>
-      <w:pPr>
-        <w:pStyle w:val="ListNumber"/>
+        <w:ind w:left="360" w:hanging="360"/>
+      </w:pPr>
+      <w:r>
+        <w:t>5. Answers that pupils are meant to discover should initially appear as ? or remain hidden. Reveal them only after the intended manipulation or an explicit reveal action.</w:t>
+      </w:r>
+    </w:p>
+    <w:p>
+      <w:pPr>
         <w:spacing w:after="60"/>
-      </w:pPr>
-      <w:r>
-        <w:t>Controls must visibly change the mathematical model. A slider, dragged point, block, clock hand, shape, token, or card should update smoothly and directly.</w:t>
-      </w:r>
-    </w:p>
-    <w:p>
-      <w:pPr>
-        <w:pStyle w:val="ListNumber"/>
+        <w:ind w:left="360" w:hanging="360"/>
+      </w:pPr>
+      <w:r>
+        <w:t>6. Controls must visibly change the mathematical model. A slider, dragged point, block, clock hand, shape, token, or card should update smoothly and directly.</w:t>
+      </w:r>
+    </w:p>
+    <w:p>
+      <w:pPr>
         <w:spacing w:after="60"/>
-      </w:pPr>
-      <w:r>
-        <w:t>Support Bahasa Melayu, Chinese, and English unless the specific tool states otherwise.</w:t>
-      </w:r>
-    </w:p>
-    <w:p>
-      <w:pPr>
-        <w:pStyle w:val="ListNumber"/>
+        <w:ind w:left="360" w:hanging="360"/>
+      </w:pPr>
+      <w:r>
+        <w:t>7. Support Bahasa Melayu, Chinese, and English unless the specific tool states otherwise.</w:t>
+      </w:r>
+    </w:p>
+    <w:p>
+      <w:pPr>
         <w:spacing w:after="60"/>
-      </w:pPr>
-      <w:r>
-        <w:t>Keep desktop, tablet, and mobile layouts usable. Always check for horizontal overflow, clipped text, overlapping labels, deformed text, and unreachable controls.</w:t>
-      </w:r>
-    </w:p>
-    <w:p>
-      <w:pPr>
-        <w:pStyle w:val="ListNumber"/>
+        <w:ind w:left="360" w:hanging="360"/>
+      </w:pPr>
+      <w:r>
+        <w:t>8. Keep desktop, tablet, and mobile layouts usable. Always check for horizontal overflow, clipped text, overlapping labels, deformed text, and unreachable controls.</w:t>
+      </w:r>
+    </w:p>
+    <w:p>
+      <w:pPr>
         <w:spacing w:after="60"/>
-      </w:pPr>
-      <w:r>
-        <w:t>Reuse the established warm yellow classroom visual system when extending existing tools.</w:t>
-      </w:r>
-    </w:p>
-    <w:p>
-      <w:pPr>
-        <w:pStyle w:val="ListNumber"/>
+        <w:ind w:left="360" w:hanging="360"/>
+      </w:pPr>
+      <w:r>
+        <w:t>9. Reuse the established warm yellow classroom visual system when extending existing tools.</w:t>
+      </w:r>
+    </w:p>
+    <w:p>
+      <w:pPr>
         <w:spacing w:after="60"/>
-      </w:pPr>
-      <w:r>
-        <w:t>Teacher settings should configure demonstration data or activities. They should not pretend to be an automatic question generator when the tool is meant for concept exploration.</w:t>
+        <w:ind w:left="360" w:hanging="360"/>
+        <w:rPr>
+          <w:b/>
+        </w:rPr>
+      </w:pPr>
+      <w:r>
+        <w:t>10. Teacher settings should configure demonstration data or activities. They should not pretend to be an automatic question generator when the tool is meant for concept exploration.</w:t>
       </w:r>
     </w:p>
     <w:p>
       <w:pPr>
         <w:pStyle w:val="Heading1"/>
         <w:spacing w:before="0"/>
-      </w:pPr>
-      <w:bookmarkStart w:id="1" w:name="_Toc242889252"/>
+        <w:ind w:left="360" w:hanging="360"/>
+      </w:pPr>
+      <w:bookmarkStart w:id="1" w:name="_Toc242890198"/>
       <w:r>
         <w:t>Repository and publishing workflow</w:t>
       </w:r>
@@ -2153,7 +2282,7 @@
         <w:pStyle w:val="Heading1"/>
         <w:spacing w:before="0"/>
       </w:pPr>
-      <w:bookmarkStart w:id="2" w:name="_Toc242889253"/>
+      <w:bookmarkStart w:id="2" w:name="_Toc242890199"/>
       <w:r>
         <w:t>Main tool inventory</w:t>
       </w:r>
@@ -2164,7 +2293,7 @@
         <w:pStyle w:val="Heading2"/>
         <w:spacing w:before="0" w:after="100"/>
       </w:pPr>
-      <w:bookmarkStart w:id="3" w:name="_Toc242889254"/>
+      <w:bookmarkStart w:id="3" w:name="_Toc242890200"/>
       <w:r>
         <w:t>SmartNumberBuilderTool</w:t>
       </w:r>
@@ -2238,7 +2367,7 @@
         <w:pStyle w:val="Heading2"/>
         <w:spacing w:before="0" w:after="100"/>
       </w:pPr>
-      <w:bookmarkStart w:id="4" w:name="_Toc242889255"/>
+      <w:bookmarkStart w:id="4" w:name="_Toc242890201"/>
       <w:r>
         <w:t>SmartNumberLineTool</w:t>
       </w:r>
@@ -2268,6 +2397,7 @@
         <w:spacing w:after="50"/>
       </w:pPr>
       <w:r>
+        <w:lastRenderedPageBreak/>
         <w:t>Fixed years: Math Year 1 to Math Year 3</w:t>
       </w:r>
     </w:p>
@@ -2286,7 +2416,6 @@
         <w:spacing w:after="50"/>
       </w:pPr>
       <w:r>
-        <w:lastRenderedPageBreak/>
         <w:t>Completed work: simplified the interface for younger pupils, added child-friendly styling and sound, corrected comparison and mobile layout, added pattern direction options, and exported three fixed-year editions.</w:t>
       </w:r>
     </w:p>
@@ -2304,7 +2433,7 @@
         <w:pStyle w:val="Heading2"/>
         <w:spacing w:before="0" w:after="100"/>
       </w:pPr>
-      <w:bookmarkStart w:id="5" w:name="_Toc242889256"/>
+      <w:bookmarkStart w:id="5" w:name="_Toc242890202"/>
       <w:r>
         <w:t>AbacusMathTool</w:t>
       </w:r>
@@ -2369,7 +2498,7 @@
         <w:pStyle w:val="Heading2"/>
         <w:spacing w:before="0" w:after="100"/>
       </w:pPr>
-      <w:bookmarkStart w:id="6" w:name="_Toc242889257"/>
+      <w:bookmarkStart w:id="6" w:name="_Toc242890203"/>
       <w:r>
         <w:t>BeadMathTool</w:t>
       </w:r>
@@ -2434,7 +2563,7 @@
         <w:pStyle w:val="Heading2"/>
         <w:spacing w:before="0" w:after="100"/>
       </w:pPr>
-      <w:bookmarkStart w:id="7" w:name="_Toc242889258"/>
+      <w:bookmarkStart w:id="7" w:name="_Toc242890204"/>
       <w:r>
         <w:t>BlockMathToolMutiFunction</w:t>
       </w:r>
@@ -2517,7 +2646,7 @@
         <w:pStyle w:val="Heading2"/>
         <w:spacing w:before="0" w:after="100"/>
       </w:pPr>
-      <w:bookmarkStart w:id="8" w:name="_Toc242889259"/>
+      <w:bookmarkStart w:id="8" w:name="_Toc242890205"/>
       <w:r>
         <w:t>SmartFractionVisualTool</w:t>
       </w:r>
@@ -2591,7 +2720,7 @@
         <w:pStyle w:val="Heading2"/>
         <w:spacing w:before="0" w:after="100"/>
       </w:pPr>
-      <w:bookmarkStart w:id="9" w:name="_Toc242889260"/>
+      <w:bookmarkStart w:id="9" w:name="_Toc242890206"/>
       <w:r>
         <w:t>SmartTimeTool</w:t>
       </w:r>
@@ -2630,6 +2759,7 @@
         <w:spacing w:after="50"/>
       </w:pPr>
       <w:r>
+        <w:lastRenderedPageBreak/>
         <w:t>Purpose: analogue clocks, timelines, duration, time operations, calendars, time-unit conversion, world time, and date changes.</w:t>
       </w:r>
     </w:p>
@@ -2639,7 +2769,6 @@
         <w:spacing w:after="50"/>
       </w:pPr>
       <w:r>
-        <w:lastRenderedPageBreak/>
         <w:t>Completed work: built the textbook-aligned tool, added a draggable clock, corrected the background, added gear-like clock ticks and sound, improved dragging, and exported five fixed-year editions.</w:t>
       </w:r>
     </w:p>
@@ -2682,7 +2811,7 @@
         <w:pStyle w:val="Heading2"/>
         <w:spacing w:before="0" w:after="100"/>
       </w:pPr>
-      <w:bookmarkStart w:id="10" w:name="_Toc242889261"/>
+      <w:bookmarkStart w:id="10" w:name="_Toc242890207"/>
       <w:r>
         <w:t>SmartMoneyTool</w:t>
       </w:r>
@@ -2785,7 +2914,7 @@
         <w:pStyle w:val="Heading2"/>
         <w:spacing w:before="0" w:after="100"/>
       </w:pPr>
-      <w:bookmarkStart w:id="11" w:name="_Toc242889262"/>
+      <w:bookmarkStart w:id="11" w:name="_Toc242890208"/>
       <w:r>
         <w:t>SmartMeasurementLab</w:t>
       </w:r>
@@ -2880,7 +3009,7 @@
         <w:pStyle w:val="Heading2"/>
         <w:spacing w:before="0" w:after="100"/>
       </w:pPr>
-      <w:bookmarkStart w:id="12" w:name="_Toc242889263"/>
+      <w:bookmarkStart w:id="12" w:name="_Toc242890209"/>
       <w:r>
         <w:t>SmartGeometryLab</w:t>
       </w:r>
@@ -2901,6 +3030,7 @@
         <w:spacing w:after="50"/>
       </w:pPr>
       <w:r>
+        <w:lastRenderedPageBreak/>
         <w:t>Testing repository: https://github.com/WelsonAI/SmartGeometryLab.git</w:t>
       </w:r>
     </w:p>
@@ -2919,7 +3049,6 @@
         <w:spacing w:after="50"/>
       </w:pPr>
       <w:r>
-        <w:lastRenderedPageBreak/>
         <w:t>Purpose: 2D and 3D shapes, solid nets, point-grid drawing, prisms, symmetry, angle, lines, perimeter, area, volume, polygons, and circles.</w:t>
       </w:r>
     </w:p>
@@ -2966,7 +3095,7 @@
         <w:pStyle w:val="Heading2"/>
         <w:spacing w:before="0" w:after="100"/>
       </w:pPr>
-      <w:bookmarkStart w:id="13" w:name="_Toc242889264"/>
+      <w:bookmarkStart w:id="13" w:name="_Toc242890210"/>
       <w:r>
         <w:t>SmartCoordinateRatioTool</w:t>
       </w:r>
@@ -3055,7 +3184,7 @@
         <w:pStyle w:val="Heading2"/>
         <w:spacing w:before="0" w:after="100"/>
       </w:pPr>
-      <w:bookmarkStart w:id="14" w:name="_Toc242889265"/>
+      <w:bookmarkStart w:id="14" w:name="_Toc242890211"/>
       <w:r>
         <w:t>SmartDataProbabilityTool</w:t>
       </w:r>
@@ -3171,7 +3300,6 @@
     </w:p>
     <w:p>
       <w:r>
-        <w:lastRenderedPageBreak/>
         <w:t xml:space="preserve">  - The probability tool was redesigned into three visible stages: select the observed colour, compare bag quantities, and verify through draws.</w:t>
       </w:r>
     </w:p>
@@ -3190,7 +3318,7 @@
         <w:pStyle w:val="Heading2"/>
         <w:spacing w:before="0" w:after="100"/>
       </w:pPr>
-      <w:bookmarkStart w:id="15" w:name="_Toc242889266"/>
+      <w:bookmarkStart w:id="15" w:name="_Toc242890212"/>
       <w:r>
         <w:t>BlockOperationsTool</w:t>
       </w:r>
@@ -3247,7 +3375,7 @@
         <w:spacing w:after="50"/>
       </w:pPr>
       <w:r>
-        <w:t>Current state: implementation and automated tests are complete locally. The next action is to commit and push it to the WelsonAI testing repository.</w:t>
+        <w:t>Current state: implementation and automated tests are complete. The project is pushed to WelsonAI on branch main. The user has said this test version still needs changes to the addition/subtraction experience and will provide the details; do not treat it as approved. Live testing page: https://welsonai.github.io/tools-BlockOperationsTool/</w:t>
       </w:r>
     </w:p>
     <w:p>
@@ -3327,7 +3455,7 @@
         <w:pStyle w:val="Heading1"/>
         <w:spacing w:before="0"/>
       </w:pPr>
-      <w:bookmarkStart w:id="16" w:name="_Toc242889267"/>
+      <w:bookmarkStart w:id="16" w:name="_Toc242890213"/>
       <w:r>
         <w:t>Production fixed-year repositories</w:t>
       </w:r>
@@ -3343,7 +3471,7 @@
         <w:pStyle w:val="Heading2"/>
         <w:spacing w:before="0" w:after="100"/>
       </w:pPr>
-      <w:bookmarkStart w:id="17" w:name="_Toc242889268"/>
+      <w:bookmarkStart w:id="17" w:name="_Toc242890214"/>
       <w:r>
         <w:t>Number Builder</w:t>
       </w:r>
@@ -3408,7 +3536,7 @@
         <w:pStyle w:val="Heading2"/>
         <w:spacing w:before="0" w:after="100"/>
       </w:pPr>
-      <w:bookmarkStart w:id="18" w:name="_Toc242889269"/>
+      <w:bookmarkStart w:id="18" w:name="_Toc242890215"/>
       <w:r>
         <w:t>Number Line</w:t>
       </w:r>
@@ -3446,7 +3574,7 @@
         <w:pStyle w:val="Heading2"/>
         <w:spacing w:before="0" w:after="100"/>
       </w:pPr>
-      <w:bookmarkStart w:id="19" w:name="_Toc242889270"/>
+      <w:bookmarkStart w:id="19" w:name="_Toc242890216"/>
       <w:r>
         <w:t>Fractions</w:t>
       </w:r>
@@ -3466,7 +3594,7 @@
         <w:pStyle w:val="Heading2"/>
         <w:spacing w:before="0" w:after="100"/>
       </w:pPr>
-      <w:bookmarkStart w:id="20" w:name="_Toc242889271"/>
+      <w:bookmarkStart w:id="20" w:name="_Toc242890217"/>
       <w:r>
         <w:t>Time</w:t>
       </w:r>
@@ -3522,7 +3650,7 @@
         <w:pStyle w:val="Heading2"/>
         <w:spacing w:before="0" w:after="100"/>
       </w:pPr>
-      <w:bookmarkStart w:id="21" w:name="_Toc242889272"/>
+      <w:bookmarkStart w:id="21" w:name="_Toc242890218"/>
       <w:r>
         <w:t>Money</w:t>
       </w:r>
@@ -3543,7 +3671,6 @@
         <w:spacing w:after="50"/>
       </w:pPr>
       <w:r>
-        <w:lastRenderedPageBreak/>
         <w:t>https://github.com/production248/tools-SmartMoneyTool-MathYear3.git</w:t>
       </w:r>
     </w:p>
@@ -3579,7 +3706,7 @@
         <w:pStyle w:val="Heading2"/>
         <w:spacing w:before="0" w:after="100"/>
       </w:pPr>
-      <w:bookmarkStart w:id="22" w:name="_Toc242889273"/>
+      <w:bookmarkStart w:id="22" w:name="_Toc242890219"/>
       <w:r>
         <w:t>Measurement</w:t>
       </w:r>
@@ -3644,7 +3771,7 @@
         <w:pStyle w:val="Heading2"/>
         <w:spacing w:before="0" w:after="100"/>
       </w:pPr>
-      <w:bookmarkStart w:id="23" w:name="_Toc242889274"/>
+      <w:bookmarkStart w:id="23" w:name="_Toc242890220"/>
       <w:r>
         <w:t>Geometry</w:t>
       </w:r>
@@ -3700,7 +3827,7 @@
         <w:pStyle w:val="Heading2"/>
         <w:spacing w:before="0" w:after="100"/>
       </w:pPr>
-      <w:bookmarkStart w:id="24" w:name="_Toc242889275"/>
+      <w:bookmarkStart w:id="24" w:name="_Toc242890221"/>
       <w:r>
         <w:t>Coordinates and Ratio</w:t>
       </w:r>
@@ -3738,7 +3865,7 @@
         <w:pStyle w:val="Heading2"/>
         <w:spacing w:before="0" w:after="100"/>
       </w:pPr>
-      <w:bookmarkStart w:id="25" w:name="_Toc242889276"/>
+      <w:bookmarkStart w:id="25" w:name="_Toc242890222"/>
       <w:r>
         <w:t>Data and Probability</w:t>
       </w:r>
@@ -3776,7 +3903,7 @@
         <w:pStyle w:val="Heading1"/>
         <w:spacing w:before="0"/>
       </w:pPr>
-      <w:bookmarkStart w:id="26" w:name="_Toc242889277"/>
+      <w:bookmarkStart w:id="26" w:name="_Toc242890223"/>
       <w:r>
         <w:t>GitHub Pages URL convention</w:t>
       </w:r>
@@ -3812,7 +3939,7 @@
         <w:pStyle w:val="Heading1"/>
         <w:spacing w:before="0"/>
       </w:pPr>
-      <w:bookmarkStart w:id="27" w:name="_Toc242889278"/>
+      <w:bookmarkStart w:id="27" w:name="_Toc242890224"/>
       <w:r>
         <w:t>Shared edition architecture</w:t>
       </w:r>
@@ -3830,70 +3957,72 @@
     </w:p>
     <w:p>
       <w:pPr>
-        <w:pStyle w:val="ListNumber"/>
         <w:spacing w:after="60"/>
-      </w:pPr>
-      <w:r>
-        <w:t>Inspect the main source tool and all affected grade configurations.</w:t>
-      </w:r>
-    </w:p>
-    <w:p>
-      <w:pPr>
-        <w:pStyle w:val="ListNumber"/>
+        <w:ind w:left="360" w:hanging="360"/>
+      </w:pPr>
+      <w:r>
+        <w:t>1. Inspect the main source tool and all affected grade configurations.</w:t>
+      </w:r>
+    </w:p>
+    <w:p>
+      <w:pPr>
         <w:spacing w:after="60"/>
-      </w:pPr>
-      <w:r>
-        <w:t>Change the shared source first.</w:t>
-      </w:r>
-    </w:p>
-    <w:p>
-      <w:pPr>
-        <w:pStyle w:val="ListNumber"/>
+        <w:ind w:left="360" w:hanging="360"/>
+      </w:pPr>
+      <w:r>
+        <w:t>2. Change the shared source first.</w:t>
+      </w:r>
+    </w:p>
+    <w:p>
+      <w:pPr>
         <w:spacing w:after="60"/>
-      </w:pPr>
-      <w:r>
-        <w:t>Run the repository export script.</w:t>
-      </w:r>
-    </w:p>
-    <w:p>
-      <w:pPr>
-        <w:pStyle w:val="ListNumber"/>
+        <w:ind w:left="360" w:hanging="360"/>
+      </w:pPr>
+      <w:r>
+        <w:t>3. Run the repository export script.</w:t>
+      </w:r>
+    </w:p>
+    <w:p>
+      <w:pPr>
         <w:spacing w:after="60"/>
-      </w:pPr>
-      <w:r>
-        <w:t>Confirm the generated edition contains only its assigned year and tools.</w:t>
-      </w:r>
-    </w:p>
-    <w:p>
-      <w:pPr>
-        <w:pStyle w:val="ListNumber"/>
+        <w:ind w:left="360" w:hanging="360"/>
+      </w:pPr>
+      <w:r>
+        <w:t>4. Confirm the generated edition contains only its assigned year and tools.</w:t>
+      </w:r>
+    </w:p>
+    <w:p>
+      <w:pPr>
         <w:spacing w:after="60"/>
-      </w:pPr>
-      <w:r>
-        <w:t>Test representative desktop and mobile layouts.</w:t>
-      </w:r>
-    </w:p>
-    <w:p>
-      <w:pPr>
-        <w:pStyle w:val="ListNumber"/>
+        <w:ind w:left="360" w:hanging="360"/>
+      </w:pPr>
+      <w:r>
+        <w:t>5. Test representative desktop and mobile layouts.</w:t>
+      </w:r>
+    </w:p>
+    <w:p>
+      <w:pPr>
         <w:spacing w:after="60"/>
-      </w:pPr>
-      <w:r>
-        <w:t>Commit and push each affected fixed-year repository.</w:t>
-      </w:r>
-    </w:p>
-    <w:p>
-      <w:pPr>
-        <w:pStyle w:val="ListNumber"/>
+        <w:ind w:left="360" w:hanging="360"/>
+      </w:pPr>
+      <w:r>
+        <w:t>6. Commit and push each affected fixed-year repository.</w:t>
+      </w:r>
+    </w:p>
+    <w:p>
+      <w:pPr>
         <w:spacing w:after="60"/>
-      </w:pPr>
-      <w:r>
-        <w:t>Give the user every affected repository and Pages link.</w:t>
-      </w:r>
-    </w:p>
-    <w:p>
-      <w:r>
-        <w:lastRenderedPageBreak/>
+        <w:ind w:left="360" w:hanging="360"/>
+      </w:pPr>
+      <w:r>
+        <w:t>7. Give the user every affected repository and Pages link.</w:t>
+      </w:r>
+    </w:p>
+    <w:p>
+      <w:pPr>
+        <w:ind w:left="360" w:hanging="360"/>
+      </w:pPr>
+      <w:r>
         <w:t>Do not patch only one generated year folder when the same behavior belongs in shared code, unless the user explicitly requests a one-year exception.</w:t>
       </w:r>
     </w:p>
@@ -3902,7 +4031,7 @@
         <w:pStyle w:val="Heading1"/>
         <w:spacing w:before="0"/>
       </w:pPr>
-      <w:bookmarkStart w:id="28" w:name="_Toc242889279"/>
+      <w:bookmarkStart w:id="28" w:name="_Toc242890225"/>
       <w:r>
         <w:t>Testing expectations</w:t>
       </w:r>
@@ -3994,108 +4123,130 @@
         <w:pStyle w:val="Heading1"/>
         <w:spacing w:before="0"/>
       </w:pPr>
-      <w:bookmarkStart w:id="29" w:name="_Toc242889280"/>
+      <w:bookmarkStart w:id="29" w:name="_Toc242890226"/>
       <w:r>
         <w:t>Immediate continuation instructions</w:t>
       </w:r>
       <w:bookmarkEnd w:id="29"/>
     </w:p>
     <w:p>
-      <w:r>
-        <w:t>The active work is BlockOperationsTool.</w:t>
-      </w:r>
-    </w:p>
-    <w:p>
-      <w:pPr>
-        <w:pStyle w:val="ListNumber"/>
+      <w:pPr>
         <w:spacing w:after="60"/>
-      </w:pPr>
-      <w:r>
-        <w:t>Read C:\Users\User\Desktop\BlockOperationsTool\PROJECT_HANDOFF.md for the detailed implementation and tests.</w:t>
-      </w:r>
-    </w:p>
-    <w:p>
-      <w:pPr>
-        <w:pStyle w:val="ListNumber"/>
+        <w:ind w:left="360" w:hanging="360"/>
+      </w:pPr>
+      <w:r>
+        <w:t>The active work is user testing and possible refinement of BlockOperationsTool.</w:t>
+      </w:r>
+    </w:p>
+    <w:p>
+      <w:pPr>
         <w:spacing w:after="60"/>
-      </w:pPr>
-      <w:r>
-        <w:t>Initialize a Git repository in C:\Users\User\Desktop\BlockOperationsTool if it is not already initialized.</w:t>
-      </w:r>
-    </w:p>
-    <w:p>
-      <w:pPr>
-        <w:pStyle w:val="ListNumber"/>
+        <w:ind w:left="360" w:hanging="360"/>
+      </w:pPr>
+      <w:r>
+        <w:t>1. Read C:\Users\User\Desktop\BlockOperationsTool\PROJECT_HANDOFF.md for the detailed implementation and tests.</w:t>
+      </w:r>
+    </w:p>
+    <w:p>
+      <w:pPr>
         <w:spacing w:after="60"/>
-      </w:pPr>
-      <w:r>
-        <w:t>Use local commit identity WelsonAI &lt;WelsonAI@users.noreply.github.com&gt; for the WelsonAI testing commit.</w:t>
-      </w:r>
-    </w:p>
-    <w:p>
-      <w:pPr>
-        <w:pStyle w:val="ListNumber"/>
+        <w:ind w:left="360" w:hanging="360"/>
+      </w:pPr>
+      <w:r>
+        <w:t>2. Open the live testing page at https://welsonai.github.io/tools-BlockOperationsTool/ and review the user's feedback.</w:t>
+      </w:r>
+    </w:p>
+    <w:p>
+      <w:pPr>
         <w:spacing w:after="60"/>
-      </w:pPr>
-      <w:r>
-        <w:t>Add remote https://github.com/WelsonAI/tools-BlockOperationsTool.git.</w:t>
-      </w:r>
-    </w:p>
-    <w:p>
-      <w:pPr>
-        <w:pStyle w:val="ListNumber"/>
+        <w:ind w:left="360" w:hanging="360"/>
+      </w:pPr>
+      <w:r>
+        <w:t>3. Reproduce any reported issue in the local source before changing it.</w:t>
+      </w:r>
+    </w:p>
+    <w:p>
+      <w:pPr>
         <w:spacing w:after="60"/>
-      </w:pPr>
-      <w:r>
-        <w:t>Commit the source, assets, README, tests, and handoff files. Do not commit temporary Chrome profiles or generated screenshots.</w:t>
-      </w:r>
-    </w:p>
-    <w:p>
-      <w:pPr>
-        <w:pStyle w:val="ListNumber"/>
+        <w:ind w:left="360" w:hanging="360"/>
+      </w:pPr>
+      <w:r>
+        <w:t>4. Keep every mathematical activity within C:\Users\User\Downloads\Makmal edMath.pdf and the user's stated scope of block addition and subtraction.</w:t>
+      </w:r>
+    </w:p>
+    <w:p>
+      <w:pPr>
         <w:spacing w:after="60"/>
-      </w:pPr>
-      <w:r>
-        <w:t>Push branch main to WelsonAI.</w:t>
-      </w:r>
-    </w:p>
-    <w:p>
-      <w:pPr>
-        <w:pStyle w:val="ListNumber"/>
+        <w:ind w:left="360" w:hanging="360"/>
+      </w:pPr>
+      <w:r>
+        <w:t>5. Implement accepted fixes in the local project, test the interactions, and push the updated main branch to WelsonAI/tools-BlockOperationsTool.</w:t>
+      </w:r>
+    </w:p>
+    <w:p>
+      <w:pPr>
         <w:spacing w:after="60"/>
-      </w:pPr>
-      <w:r>
-        <w:t>Verify the remote contents.</w:t>
-      </w:r>
-    </w:p>
-    <w:p>
-      <w:pPr>
-        <w:pStyle w:val="ListNumber"/>
+        <w:ind w:left="360" w:hanging="360"/>
+      </w:pPr>
+      <w:r>
+        <w:t>6. Verify the remote branch and the live GitHub Pages page after pushing.</w:t>
+      </w:r>
+    </w:p>
+    <w:p>
+      <w:pPr>
         <w:spacing w:after="60"/>
-      </w:pPr>
-      <w:r>
-        <w:t>Give the user the repository link and explain how to enable or test GitHub Pages.</w:t>
-      </w:r>
-    </w:p>
-    <w:p>
-      <w:pPr>
-        <w:pStyle w:val="ListNumber"/>
+        <w:ind w:left="360" w:hanging="360"/>
+      </w:pPr>
+      <w:r>
+        <w:t>7. Give the user the updated testing link and summarize the changes.</w:t>
+      </w:r>
+    </w:p>
+    <w:p>
+      <w:pPr>
         <w:spacing w:after="60"/>
-      </w:pPr>
-      <w:r>
-        <w:t>Do not push this new tool to production248 until the user tests it and explicitly approves production publishing.</w:t>
+        <w:ind w:left="360" w:hanging="360"/>
+      </w:pPr>
+      <w:r>
+        <w:t>8. Update the handoff files when behavior or repository state changes.</w:t>
       </w:r>
     </w:p>
     <w:p>
       <w:pPr>
         <w:pStyle w:val="Heading1"/>
         <w:spacing w:before="0"/>
-      </w:pPr>
-      <w:bookmarkStart w:id="30" w:name="_Toc242889281"/>
+        <w:ind w:left="360" w:hanging="360"/>
+        <w:rPr>
+          <w:rFonts w:ascii="Aptos" w:hAnsi="Aptos" w:cstheme="minorBidi"/>
+          <w:b w:val="0"/>
+          <w:color w:val="auto"/>
+          <w:sz w:val="21"/>
+          <w:szCs w:val="24"/>
+        </w:rPr>
+      </w:pPr>
+      <w:bookmarkStart w:id="30" w:name="_Toc242890227"/>
+      <w:r>
+        <w:rPr>
+          <w:rFonts w:ascii="Aptos" w:hAnsi="Aptos" w:cstheme="minorBidi"/>
+          <w:b w:val="0"/>
+          <w:color w:val="auto"/>
+          <w:sz w:val="21"/>
+          <w:szCs w:val="24"/>
+        </w:rPr>
+        <w:t>9. Do not push this new tool to production248 until the user tests it and explicitly approves production publishing.</w:t>
+      </w:r>
+      <w:bookmarkEnd w:id="30"/>
+    </w:p>
+    <w:p>
+      <w:pPr>
+        <w:pStyle w:val="Heading1"/>
+        <w:spacing w:before="0"/>
+        <w:ind w:left="360" w:hanging="360"/>
+      </w:pPr>
+      <w:bookmarkStart w:id="31" w:name="_Toc242890228"/>
       <w:r>
         <w:t>Suggested first message for a new chat</w:t>
       </w:r>
-      <w:bookmarkEnd w:id="30"/>
+      <w:bookmarkEnd w:id="31"/>
     </w:p>
     <w:p>
       <w:r>

</xml_diff>

<commit_message>
Make block addition and subtraction student-driven
</commit_message>
<xml_diff>
--- a/MATH_TOOLS_MASTER_HANDOFF.docx
+++ b/MATH_TOOLS_MASTER_HANDOFF.docx
@@ -3326,136 +3326,194 @@
     </w:p>
     <w:p>
       <w:pPr>
-        <w:pStyle w:val="ListBullet"/>
-        <w:spacing w:after="50"/>
-      </w:pPr>
-      <w:r>
-        <w:t>Local source: C:\Users\User\Desktop\BlockOperationsTool</w:t>
-      </w:r>
-    </w:p>
-    <w:p>
-      <w:pPr>
-        <w:pStyle w:val="ListBullet"/>
-        <w:spacing w:after="50"/>
-      </w:pPr>
-      <w:r>
-        <w:t>Testing repository: https://github.com/WelsonAI/tools-BlockOperationsTool.git</w:t>
-      </w:r>
-    </w:p>
-    <w:p>
-      <w:pPr>
-        <w:pStyle w:val="ListBullet"/>
-        <w:spacing w:after="50"/>
-      </w:pPr>
-      <w:r>
-        <w:t>Production repository: not yet created or approved.</w:t>
-      </w:r>
-    </w:p>
-    <w:p>
-      <w:pPr>
-        <w:pStyle w:val="ListBullet"/>
-        <w:spacing w:after="50"/>
-      </w:pPr>
-      <w:r>
-        <w:t>Purpose: a new standalone place-value block tool containing only addition and subtraction.</w:t>
-      </w:r>
-    </w:p>
-    <w:p>
-      <w:pPr>
-        <w:pStyle w:val="ListBullet"/>
-        <w:spacing w:after="50"/>
-      </w:pPr>
-      <w:r>
-        <w:t>Curriculum source: C:\Users\User\Downloads\Makmal edMath.pdf</w:t>
-      </w:r>
-    </w:p>
-    <w:p>
-      <w:pPr>
-        <w:pStyle w:val="ListBullet"/>
-        <w:spacing w:after="50"/>
-      </w:pPr>
-      <w:r>
-        <w:t>Current state: implementation and automated tests are complete. The project is pushed to WelsonAI on branch main. The user has said this test version still needs changes to the addition/subtraction experience and will provide the details; do not treat it as approved. Live testing page: https://welsonai.github.io/tools-BlockOperationsTool/</w:t>
-      </w:r>
-    </w:p>
-    <w:p>
-      <w:pPr>
-        <w:pStyle w:val="ListBullet"/>
-        <w:spacing w:after="50"/>
-      </w:pPr>
-      <w:r>
-        <w:t>Addition scope: within 40, 100, and 1000; without regrouping; 10 ones to 1 ten; 10 tens to 1 hundred.</w:t>
-      </w:r>
-    </w:p>
-    <w:p>
-      <w:pPr>
-        <w:pStyle w:val="ListBullet"/>
-        <w:spacing w:after="50"/>
-      </w:pPr>
-      <w:r>
-        <w:t>Subtraction scope: within 40 and 100; without regrouping; 1 ten to 10 ones.</w:t>
-      </w:r>
-    </w:p>
-    <w:p>
-      <w:pPr>
-        <w:pStyle w:val="ListBullet"/>
-        <w:spacing w:after="50"/>
-      </w:pPr>
-      <w:r>
-        <w:t>Three-digit subtraction is deliberately disabled because the supplied PDF does not establish it.</w:t>
-      </w:r>
-    </w:p>
-    <w:p>
-      <w:pPr>
-        <w:pStyle w:val="ListBullet"/>
-        <w:spacing w:after="50"/>
-      </w:pPr>
-      <w:r>
-        <w:t>Teacher enters the two numbers manually. There is no random question generator.</w:t>
-      </w:r>
-    </w:p>
-    <w:p>
-      <w:pPr>
-        <w:pStyle w:val="ListBullet"/>
-        <w:spacing w:after="50"/>
-      </w:pPr>
-      <w:r>
-        <w:t>The answer starts as ? and appears only after the learner completes the block movement.</w:t>
-      </w:r>
-    </w:p>
-    <w:p>
-      <w:pPr>
-        <w:pStyle w:val="ListBullet"/>
-        <w:spacing w:after="50"/>
-      </w:pPr>
-      <w:r>
-        <w:t>The tool supports smooth drag, tap, keyboard operation, BM, Chinese, English, and a vertical-form explanation after completion.</w:t>
-      </w:r>
-    </w:p>
-    <w:p>
-      <w:pPr>
-        <w:pStyle w:val="ListBullet"/>
-        <w:spacing w:after="50"/>
-      </w:pPr>
-      <w:r>
-        <w:t>Passed regression examples: 28 + 6 = 34, 32 - 9 = 23, and 182 + 193 = 375.</w:t>
-      </w:r>
-    </w:p>
-    <w:p>
-      <w:pPr>
-        <w:pStyle w:val="ListBullet"/>
-        <w:spacing w:after="50"/>
-      </w:pPr>
-      <w:r>
-        <w:t>The original BlockMathToolMutiFunction was not modified.</w:t>
-      </w:r>
-    </w:p>
-    <w:p>
-      <w:pPr>
         <w:pStyle w:val="Heading1"/>
         <w:spacing w:before="0"/>
+        <w:rPr>
+          <w:rFonts w:ascii="Aptos" w:hAnsi="Aptos" w:cstheme="minorBidi"/>
+          <w:b w:val="0"/>
+          <w:color w:val="auto"/>
+          <w:sz w:val="21"/>
+          <w:szCs w:val="24"/>
+        </w:rPr>
       </w:pPr>
       <w:bookmarkStart w:id="16" w:name="_Toc242890213"/>
+      <w:r>
+        <w:rPr>
+          <w:rFonts w:ascii="Aptos" w:hAnsi="Aptos" w:cstheme="minorBidi"/>
+          <w:b w:val="0"/>
+          <w:color w:val="auto"/>
+          <w:sz w:val="21"/>
+          <w:szCs w:val="24"/>
+        </w:rPr>
+        <w:t>Local source: C:\Users\User\Desktop\BlockOperationsTool. Testing repository: https://github.com/WelsonAI/tools-BlockOperationsTool.git. Production repository: not created or approved.</w:t>
+      </w:r>
+    </w:p>
+    <w:p>
+      <w:pPr>
+        <w:pStyle w:val="Heading1"/>
+        <w:spacing w:before="0"/>
+        <w:rPr>
+          <w:rFonts w:ascii="Aptos" w:hAnsi="Aptos" w:cstheme="minorBidi"/>
+          <w:b w:val="0"/>
+          <w:color w:val="auto"/>
+          <w:sz w:val="21"/>
+          <w:szCs w:val="24"/>
+        </w:rPr>
+      </w:pPr>
+      <w:r>
+        <w:rPr>
+          <w:rFonts w:ascii="Aptos" w:hAnsi="Aptos" w:cstheme="minorBidi"/>
+          <w:b w:val="0"/>
+          <w:color w:val="auto"/>
+          <w:sz w:val="21"/>
+          <w:szCs w:val="24"/>
+        </w:rPr>
+        <w:t>Purpose: standalone base-ten block addition and subtraction. Curriculum source: C:\Users\User\Downloads\Makmal edMath.pdf.</w:t>
+      </w:r>
+    </w:p>
+    <w:p>
+      <w:pPr>
+        <w:pStyle w:val="Heading1"/>
+        <w:spacing w:before="0"/>
+        <w:rPr>
+          <w:rFonts w:ascii="Aptos" w:hAnsi="Aptos" w:cstheme="minorBidi"/>
+          <w:b w:val="0"/>
+          <w:color w:val="auto"/>
+          <w:sz w:val="21"/>
+          <w:szCs w:val="24"/>
+        </w:rPr>
+      </w:pPr>
+      <w:r>
+        <w:rPr>
+          <w:rFonts w:ascii="Aptos" w:hAnsi="Aptos" w:cstheme="minorBidi"/>
+          <w:b w:val="0"/>
+          <w:color w:val="auto"/>
+          <w:sz w:val="21"/>
+          <w:szCs w:val="24"/>
+        </w:rPr>
+        <w:t>Live testing page: https://welsonai.github.io/tools-BlockOperationsTool/. The revised student-operated version is locally tested but still awaits user review.</w:t>
+      </w:r>
+    </w:p>
+    <w:p>
+      <w:pPr>
+        <w:pStyle w:val="Heading1"/>
+        <w:spacing w:before="0"/>
+        <w:rPr>
+          <w:rFonts w:ascii="Aptos" w:hAnsi="Aptos" w:cstheme="minorBidi"/>
+          <w:b w:val="0"/>
+          <w:color w:val="auto"/>
+          <w:sz w:val="21"/>
+          <w:szCs w:val="24"/>
+        </w:rPr>
+      </w:pPr>
+      <w:r>
+        <w:rPr>
+          <w:rFonts w:ascii="Aptos" w:hAnsi="Aptos" w:cstheme="minorBidi"/>
+          <w:b w:val="0"/>
+          <w:color w:val="auto"/>
+          <w:sz w:val="21"/>
+          <w:szCs w:val="24"/>
+        </w:rPr>
+        <w:t>The PDF supplies the original base-ten method and examples. Open user-entered numbers extend that method; they are not labelled textbook examples. There is no random question generator.</w:t>
+      </w:r>
+    </w:p>
+    <w:p>
+      <w:pPr>
+        <w:pStyle w:val="Heading1"/>
+        <w:spacing w:before="0"/>
+        <w:rPr>
+          <w:rFonts w:ascii="Aptos" w:hAnsi="Aptos" w:cstheme="minorBidi"/>
+          <w:b w:val="0"/>
+          <w:color w:val="auto"/>
+          <w:sz w:val="21"/>
+          <w:szCs w:val="24"/>
+        </w:rPr>
+      </w:pPr>
+      <w:r>
+        <w:rPr>
+          <w:rFonts w:ascii="Aptos" w:hAnsi="Aptos" w:cstheme="minorBidi"/>
+          <w:b w:val="0"/>
+          <w:color w:val="auto"/>
+          <w:sz w:val="21"/>
+          <w:szCs w:val="24"/>
+        </w:rPr>
+        <w:t>Blocks are ready to drag on load. Students drag blocks into place-value columns, drag a group of ten upward to carry, and drag a higher block downward to split it into ten for borrowing. Cascading borrowing is supported.</w:t>
+      </w:r>
+    </w:p>
+    <w:p>
+      <w:pPr>
+        <w:pStyle w:val="Heading1"/>
+        <w:spacing w:before="0"/>
+        <w:rPr>
+          <w:rFonts w:ascii="Aptos" w:hAnsi="Aptos" w:cstheme="minorBidi"/>
+          <w:b w:val="0"/>
+          <w:color w:val="auto"/>
+          <w:sz w:val="21"/>
+          <w:szCs w:val="24"/>
+        </w:rPr>
+      </w:pPr>
+      <w:r>
+        <w:rPr>
+          <w:rFonts w:ascii="Aptos" w:hAnsi="Aptos" w:cstheme="minorBidi"/>
+          <w:b w:val="0"/>
+          <w:color w:val="auto"/>
+          <w:sz w:val="21"/>
+          <w:szCs w:val="24"/>
+        </w:rPr>
+        <w:t>The vertical working stays visible on the right and updates live. Guidance runs top to bottom. Dynamic place-value columns have no preset numeric maximum.</w:t>
+      </w:r>
+    </w:p>
+    <w:p>
+      <w:pPr>
+        <w:pStyle w:val="Heading1"/>
+        <w:spacing w:before="0"/>
+        <w:rPr>
+          <w:rFonts w:ascii="Aptos" w:hAnsi="Aptos" w:cstheme="minorBidi"/>
+          <w:b w:val="0"/>
+          <w:color w:val="auto"/>
+          <w:sz w:val="21"/>
+          <w:szCs w:val="24"/>
+        </w:rPr>
+      </w:pPr>
+      <w:r>
+        <w:rPr>
+          <w:rFonts w:ascii="Aptos" w:hAnsi="Aptos" w:cstheme="minorBidi"/>
+          <w:b w:val="0"/>
+          <w:color w:val="auto"/>
+          <w:sz w:val="21"/>
+          <w:szCs w:val="24"/>
+        </w:rPr>
+        <w:t>The answer remains ? until the learner completes the movement. Supports drag, tap, keyboard operation, BM, Chinese, and English.</w:t>
+      </w:r>
+    </w:p>
+    <w:p>
+      <w:pPr>
+        <w:pStyle w:val="Heading1"/>
+        <w:spacing w:before="0"/>
+        <w:rPr>
+          <w:rFonts w:ascii="Aptos" w:hAnsi="Aptos" w:cstheme="minorBidi"/>
+          <w:b w:val="0"/>
+          <w:color w:val="auto"/>
+          <w:sz w:val="21"/>
+          <w:szCs w:val="24"/>
+        </w:rPr>
+      </w:pPr>
+      <w:r>
+        <w:rPr>
+          <w:rFonts w:ascii="Aptos" w:hAnsi="Aptos" w:cstheme="minorBidi"/>
+          <w:b w:val="0"/>
+          <w:color w:val="auto"/>
+          <w:sz w:val="21"/>
+          <w:szCs w:val="24"/>
+        </w:rPr>
+        <w:t>Passed: 28 + 6 = 34; 32 - 9 = 23; 1000 - 1 = 999; 999 + 1 = 1000; 20-digit input; mobile layout. The original BlockMathToolMutiFunction was not modified.</w:t>
+      </w:r>
+    </w:p>
+    <w:p>
+      <w:pPr>
+        <w:pStyle w:val="Heading1"/>
+        <w:spacing w:before="0"/>
+      </w:pPr>
       <w:r>
         <w:t>Production fixed-year repositories</w:t>
       </w:r>
@@ -4135,7 +4193,7 @@
         <w:ind w:left="360" w:hanging="360"/>
       </w:pPr>
       <w:r>
-        <w:t>The active work is user testing and possible refinement of BlockOperationsTool.</w:t>
+        <w:t>The active work is reviewing the revised BlockOperationsTool with the user and making any further requested refinements.</w:t>
       </w:r>
     </w:p>
     <w:p>

</xml_diff>

<commit_message>
Start block operations with empty boards and reversible subtraction
</commit_message>
<xml_diff>
--- a/MATH_TOOLS_MASTER_HANDOFF.docx
+++ b/MATH_TOOLS_MASTER_HANDOFF.docx
@@ -3368,7 +3368,7 @@
           <w:sz w:val="21"/>
           <w:szCs w:val="24"/>
         </w:rPr>
-        <w:t>Purpose: standalone base-ten block addition and subtraction. Curriculum source: C:\Users\User\Downloads\Makmal edMath.pdf.</w:t>
+        <w:t>Purpose: standalone base-ten block addition and subtraction. Curriculum source: C:\Users\User\Downloads\Makmal edMath.pdf. Open user-entered numbers extend the supplied block method; they are not labelled textbook examples.</w:t>
       </w:r>
     </w:p>
     <w:p>
@@ -3391,7 +3391,7 @@
           <w:sz w:val="21"/>
           <w:szCs w:val="24"/>
         </w:rPr>
-        <w:t>Live testing page: https://welsonai.github.io/tools-BlockOperationsTool/. The revised student-operated version is locally tested but still awaits user review.</w:t>
+        <w:t>The number boards start empty. Pupils drag reusable blocks from the supply to build the given numbers. The vertical working stays visible; steps run top to bottom and the answer remains hidden until completion.</w:t>
       </w:r>
     </w:p>
     <w:p>
@@ -3414,7 +3414,7 @@
           <w:sz w:val="21"/>
           <w:szCs w:val="24"/>
         </w:rPr>
-        <w:t>The PDF supplies the original base-ten method and examples. Open user-entered numbers extend that method; they are not labelled textbook examples. There is no random question generator.</w:t>
+        <w:t>In addition, pupils build A and B, combine them, and drag groups of ten one place higher to carry. Ones line up five per row; narrow screens stack the place-value columns.</w:t>
       </w:r>
     </w:p>
     <w:p>
@@ -3437,7 +3437,7 @@
           <w:sz w:val="21"/>
           <w:szCs w:val="24"/>
         </w:rPr>
-        <w:t>Blocks are ready to drag on load. Students drag blocks into place-value columns, drag a group of ten upward to carry, and drag a higher block downward to split it into ten for borrowing. Cascading borrowing is supported.</w:t>
+        <w:t>In subtraction, pupils build the starting number. The recycle bin shows only the value to subtract, such as 28, without a 9/9-style block counter or pre-decomposed hint. Pupils decide which blocks to remove; a mistaken block can be dragged back, even after completion.</w:t>
       </w:r>
     </w:p>
     <w:p>
@@ -3460,7 +3460,7 @@
           <w:sz w:val="21"/>
           <w:szCs w:val="24"/>
         </w:rPr>
-        <w:t>The vertical working stays visible on the right and updates live. Guidance runs top to bottom. Dynamic place-value columns have no preset numeric maximum.</w:t>
+        <w:t>Pupils borrow by dragging one higher block down to split it into ten. Cascading borrowing through zeros is supported. The working-block heading identifies the starting value, avoiding a misleading label after regrouping.</w:t>
       </w:r>
     </w:p>
     <w:p>
@@ -3483,7 +3483,7 @@
           <w:sz w:val="21"/>
           <w:szCs w:val="24"/>
         </w:rPr>
-        <w:t>The answer remains ? until the learner completes the movement. Supports drag, tap, keyboard operation, BM, Chinese, and English.</w:t>
+        <w:t>Numbers are entered manually with no preset range or random question generator. Supports pointer dragging, tap, keyboard operation, BM, Chinese, and English. The original BlockMathToolMutiFunction was not modified.</w:t>
       </w:r>
     </w:p>
     <w:p>
@@ -3506,7 +3506,7 @@
           <w:sz w:val="21"/>
           <w:szCs w:val="24"/>
         </w:rPr>
-        <w:t>Passed: 28 + 6 = 34; 32 - 9 = 23; 1000 - 1 = 999; 999 + 1 = 1000; 20-digit input; mobile layout. The original BlockMathToolMutiFunction was not modified.</w:t>
+        <w:t>Passed: 28 + 6 = 34; 32 - 9 = 23; 500 - 28 = 472; 1000 - 1 = 999; 999 + 1 = 1000; reversible subtraction; 20-digit input; desktop and mobile layouts. This remains a WelsonAI testing version until the user reviews it.</w:t>
       </w:r>
     </w:p>
     <w:p>

</xml_diff>